<commit_message>
docs: update final report for heart disease prediction submission
</commit_message>
<xml_diff>
--- a/submission/Heart Disease Prediction Final Report.docx
+++ b/submission/Heart Disease Prediction Final Report.docx
@@ -97,28 +97,7 @@
           <w:rFonts w:ascii="Times New Roman" w:hAnsi="Times New Roman" w:cs="Times New Roman"/>
           <w:lang w:val="en-US"/>
         </w:rPr>
-        <w:t xml:space="preserve">Heart Disease Prediction project turns a binary classifier into a tool that checks for </w:t>
-      </w:r>
-      <w:r>
-        <w:rPr>
-          <w:rFonts w:ascii="Times New Roman" w:hAnsi="Times New Roman" w:cs="Times New Roman"/>
-          <w:lang w:val="en-US"/>
-        </w:rPr>
-        <w:t>heart disease using the UCI Processed Cleveland dataset. Heart Disease Prediction focus is not on how well the model predicts; Heart Disease Prediction also brings together data quality checks reproducible model selection, experiment tracking, packaging, automated validation, containeri</w:t>
-      </w:r>
-      <w:r>
-        <w:rPr>
-          <w:rFonts w:ascii="Times New Roman" w:hAnsi="Times New Roman" w:cs="Times New Roman"/>
-          <w:lang w:val="en-US"/>
-        </w:rPr>
-        <w:t>z</w:t>
-      </w:r>
-      <w:r>
-        <w:rPr>
-          <w:rFonts w:ascii="Times New Roman" w:hAnsi="Times New Roman" w:cs="Times New Roman"/>
-          <w:lang w:val="en-US"/>
-        </w:rPr>
-        <w:t>ed serving, Kubernetes deployment and request‑level monitoring into a single traceable MLOps demonstration.</w:t>
+        <w:t>Heart Disease Prediction project turns a binary classifier into a tool that checks for heart disease using the UCI Processed Cleveland dataset. Heart Disease Prediction focus is not on how well the model predicts; Heart Disease Prediction also brings together data quality checks reproducible model selection, experiment tracking, packaging, automated validation, containerized serving, Kubernetes deployment and request‑level monitoring into a single traceable MLOps demonstration.</w:t>
       </w:r>
     </w:p>
     <w:p>
@@ -306,14 +285,7 @@
           <w:rFonts w:ascii="Times New Roman" w:hAnsi="Times New Roman" w:cs="Times New Roman"/>
           <w:lang w:val="en-US"/>
         </w:rPr>
-        <w:t xml:space="preserve">Prepare the </w:t>
-      </w:r>
-      <w:r>
-        <w:rPr>
-          <w:rFonts w:ascii="Times New Roman" w:hAnsi="Times New Roman" w:cs="Times New Roman"/>
-          <w:lang w:val="en-US"/>
-        </w:rPr>
-        <w:t>source dataset inspect feature distributions and class balance and build a train/test workflow.</w:t>
+        <w:t>Prepare the source dataset inspect feature distributions and class balance and build a train/test workflow.</w:t>
       </w:r>
     </w:p>
     <w:p>
@@ -333,14 +305,7 @@
           <w:rFonts w:ascii="Times New Roman" w:hAnsi="Times New Roman" w:cs="Times New Roman"/>
           <w:lang w:val="en-US"/>
         </w:rPr>
-        <w:t xml:space="preserve">Compare four </w:t>
-      </w:r>
-      <w:r>
-        <w:rPr>
-          <w:rFonts w:ascii="Times New Roman" w:hAnsi="Times New Roman" w:cs="Times New Roman"/>
-          <w:lang w:val="en-US"/>
-        </w:rPr>
-        <w:t>model families under five‑fold cross‑validation; choose the best candidate before looking at the held‑out test set.</w:t>
+        <w:t>Compare four model families under five‑fold cross‑validation; choose the best candidate before looking at the held‑out test set.</w:t>
       </w:r>
     </w:p>
     <w:p>
@@ -360,14 +325,7 @@
           <w:rFonts w:ascii="Times New Roman" w:hAnsi="Times New Roman" w:cs="Times New Roman"/>
           <w:lang w:val="en-US"/>
         </w:rPr>
-        <w:t xml:space="preserve">Track metrics in </w:t>
-      </w:r>
-      <w:r>
-        <w:rPr>
-          <w:rFonts w:ascii="Times New Roman" w:hAnsi="Times New Roman" w:cs="Times New Roman"/>
-          <w:lang w:val="en-US"/>
-        </w:rPr>
-        <w:t>MLflow package the fitted pipeline and register a versioned champion model.</w:t>
+        <w:t>Track metrics in MLflow package the fitted pipeline and register a versioned champion model.</w:t>
       </w:r>
     </w:p>
     <w:p>
@@ -387,14 +345,7 @@
           <w:rFonts w:ascii="Times New Roman" w:hAnsi="Times New Roman" w:cs="Times New Roman"/>
           <w:lang w:val="en-US"/>
         </w:rPr>
-        <w:t xml:space="preserve">Validate source changes </w:t>
-      </w:r>
-      <w:r>
-        <w:rPr>
-          <w:rFonts w:ascii="Times New Roman" w:hAnsi="Times New Roman" w:cs="Times New Roman"/>
-          <w:lang w:val="en-US"/>
-        </w:rPr>
-        <w:t>through GitHub Actions build a Docker image serve predictions on K3s and watch API health and latency.</w:t>
+        <w:t>Validate source changes through GitHub Actions build a Docker image serve predictions on K3s and watch API health and latency.</w:t>
       </w:r>
     </w:p>
     <w:p>
@@ -444,56 +395,7 @@
           <w:rFonts w:ascii="Times New Roman" w:hAnsi="Times New Roman" w:cs="Times New Roman"/>
           <w:lang w:val="en-US"/>
         </w:rPr>
-        <w:t>The repository contains</w:t>
-      </w:r>
-      <w:r>
-        <w:rPr>
-          <w:rFonts w:ascii="Times New Roman" w:hAnsi="Times New Roman" w:cs="Times New Roman"/>
-          <w:lang w:val="en-US"/>
-        </w:rPr>
-        <w:t xml:space="preserve"> scripts and a CI workflow. The deployed API uses a model from a MLflow registry</w:t>
-      </w:r>
-      <w:r>
-        <w:rPr>
-          <w:rFonts w:ascii="Times New Roman" w:hAnsi="Times New Roman" w:cs="Times New Roman"/>
-          <w:lang w:val="en-US"/>
-        </w:rPr>
-        <w:t>,</w:t>
-      </w:r>
-      <w:r>
-        <w:rPr>
-          <w:rFonts w:ascii="Times New Roman" w:hAnsi="Times New Roman" w:cs="Times New Roman"/>
-          <w:lang w:val="en-US"/>
-        </w:rPr>
-        <w:t xml:space="preserve"> CI does not push a new model or deploy containers. Kubernetes and the </w:t>
-      </w:r>
-      <w:r>
-        <w:rPr>
-          <w:rFonts w:ascii="Times New Roman" w:hAnsi="Times New Roman" w:cs="Times New Roman"/>
-          <w:lang w:val="en-US"/>
-        </w:rPr>
-        <w:t>Load Balancer</w:t>
-      </w:r>
-      <w:r>
-        <w:rPr>
-          <w:rFonts w:ascii="Times New Roman" w:hAnsi="Times New Roman" w:cs="Times New Roman"/>
-          <w:lang w:val="en-US"/>
-        </w:rPr>
-        <w:t xml:space="preserve"> stay local to the development environment</w:t>
-      </w:r>
-      <w:r>
-        <w:rPr>
-          <w:rFonts w:ascii="Times New Roman" w:hAnsi="Times New Roman" w:cs="Times New Roman"/>
-          <w:lang w:val="en-US"/>
-        </w:rPr>
-        <w:t xml:space="preserve"> and a</w:t>
-      </w:r>
-      <w:r>
-        <w:rPr>
-          <w:rFonts w:ascii="Times New Roman" w:hAnsi="Times New Roman" w:cs="Times New Roman"/>
-          <w:lang w:val="en-US"/>
-        </w:rPr>
-        <w:t>re not publicly hosted.</w:t>
+        <w:t>The repository contains scripts and a CI workflow. The deployed API uses a model from a MLflow registry, CI does not push a new model or deploy containers. Kubernetes and the Load Balancer stay local to the development environment and are not publicly hosted.</w:t>
       </w:r>
     </w:p>
     <w:p>
@@ -656,42 +558,7 @@
                 <w:rFonts w:ascii="Times New Roman" w:hAnsi="Times New Roman" w:cs="Times New Roman"/>
                 <w:lang w:val="en-US"/>
               </w:rPr>
-              <w:t xml:space="preserve">Held-out accuracy: </w:t>
-            </w:r>
-            <w:r>
-              <w:rPr>
-                <w:rFonts w:ascii="Times New Roman" w:hAnsi="Times New Roman" w:cs="Times New Roman"/>
-                <w:lang w:val="en-US"/>
-              </w:rPr>
-              <w:t>88.52%</w:t>
-            </w:r>
-            <w:r>
-              <w:rPr>
-                <w:rFonts w:ascii="Times New Roman" w:hAnsi="Times New Roman" w:cs="Times New Roman"/>
-                <w:lang w:val="en-US"/>
-              </w:rPr>
-              <w:t>,</w:t>
-            </w:r>
-            <w:r>
-              <w:rPr>
-                <w:rFonts w:ascii="Times New Roman" w:hAnsi="Times New Roman" w:cs="Times New Roman"/>
-                <w:lang w:val="en-US"/>
-              </w:rPr>
-              <w:t xml:space="preserve"> </w:t>
-            </w:r>
-            <w:r>
-              <w:rPr>
-                <w:rFonts w:ascii="Times New Roman" w:hAnsi="Times New Roman" w:cs="Times New Roman"/>
-                <w:lang w:val="en-US"/>
-              </w:rPr>
-              <w:t>R</w:t>
-            </w:r>
-            <w:r>
-              <w:rPr>
-                <w:rFonts w:ascii="Times New Roman" w:hAnsi="Times New Roman" w:cs="Times New Roman"/>
-                <w:lang w:val="en-US"/>
-              </w:rPr>
-              <w:t>ecall: 92.86%</w:t>
+              <w:t>Held-out accuracy: 88.52%, Recall: 92.86%</w:t>
             </w:r>
           </w:p>
         </w:tc>
@@ -711,14 +578,7 @@
                 <w:rFonts w:ascii="Times New Roman" w:hAnsi="Times New Roman" w:cs="Times New Roman"/>
                 <w:lang w:val="en-US"/>
               </w:rPr>
-              <w:t xml:space="preserve">22 automated </w:t>
-            </w:r>
-            <w:r>
-              <w:rPr>
-                <w:rFonts w:ascii="Times New Roman" w:hAnsi="Times New Roman" w:cs="Times New Roman"/>
-                <w:lang w:val="en-US"/>
-              </w:rPr>
-              <w:t>tests; lint, train, Docker validation</w:t>
+              <w:t>22 automated tests; lint, train, Docker validation</w:t>
             </w:r>
           </w:p>
         </w:tc>
@@ -743,112 +603,7 @@
                 <w:rFonts w:ascii="Times New Roman" w:hAnsi="Times New Roman" w:cs="Times New Roman"/>
                 <w:lang w:val="en-US"/>
               </w:rPr>
-              <w:t xml:space="preserve">61 test cases, </w:t>
-            </w:r>
-            <w:r>
-              <w:rPr>
-                <w:rFonts w:ascii="Times New Roman" w:hAnsi="Times New Roman" w:cs="Times New Roman"/>
-                <w:lang w:val="en-US"/>
-              </w:rPr>
-              <w:t>TN</w:t>
-            </w:r>
-            <w:r>
-              <w:rPr>
-                <w:rFonts w:ascii="Times New Roman" w:hAnsi="Times New Roman" w:cs="Times New Roman"/>
-                <w:lang w:val="en-US"/>
-              </w:rPr>
-              <w:t>:</w:t>
-            </w:r>
-            <w:r>
-              <w:rPr>
-                <w:rFonts w:ascii="Times New Roman" w:hAnsi="Times New Roman" w:cs="Times New Roman"/>
-                <w:lang w:val="en-US"/>
-              </w:rPr>
-              <w:t xml:space="preserve"> 28</w:t>
-            </w:r>
-            <w:r>
-              <w:rPr>
-                <w:rFonts w:ascii="Times New Roman" w:hAnsi="Times New Roman" w:cs="Times New Roman"/>
-                <w:lang w:val="en-US"/>
-              </w:rPr>
-              <w:t>,</w:t>
-            </w:r>
-            <w:r>
-              <w:rPr>
-                <w:rFonts w:ascii="Times New Roman" w:hAnsi="Times New Roman" w:cs="Times New Roman"/>
-                <w:lang w:val="en-US"/>
-              </w:rPr>
-              <w:t xml:space="preserve"> FP</w:t>
-            </w:r>
-            <w:r>
-              <w:rPr>
-                <w:rFonts w:ascii="Times New Roman" w:hAnsi="Times New Roman" w:cs="Times New Roman"/>
-                <w:lang w:val="en-US"/>
-              </w:rPr>
-              <w:t>:</w:t>
-            </w:r>
-            <w:r>
-              <w:rPr>
-                <w:rFonts w:ascii="Times New Roman" w:hAnsi="Times New Roman" w:cs="Times New Roman"/>
-                <w:lang w:val="en-US"/>
-              </w:rPr>
-              <w:t xml:space="preserve"> 5</w:t>
-            </w:r>
-            <w:r>
-              <w:rPr>
-                <w:rFonts w:ascii="Times New Roman" w:hAnsi="Times New Roman" w:cs="Times New Roman"/>
-                <w:lang w:val="en-US"/>
-              </w:rPr>
-              <w:t>,</w:t>
-            </w:r>
-            <w:r>
-              <w:rPr>
-                <w:rFonts w:ascii="Times New Roman" w:hAnsi="Times New Roman" w:cs="Times New Roman"/>
-                <w:lang w:val="en-US"/>
-              </w:rPr>
-              <w:t xml:space="preserve"> FN</w:t>
-            </w:r>
-            <w:r>
-              <w:rPr>
-                <w:rFonts w:ascii="Times New Roman" w:hAnsi="Times New Roman" w:cs="Times New Roman"/>
-                <w:lang w:val="en-US"/>
-              </w:rPr>
-              <w:t>:</w:t>
-            </w:r>
-            <w:r>
-              <w:rPr>
-                <w:rFonts w:ascii="Times New Roman" w:hAnsi="Times New Roman" w:cs="Times New Roman"/>
-                <w:lang w:val="en-US"/>
-              </w:rPr>
-              <w:t xml:space="preserve"> 2</w:t>
-            </w:r>
-            <w:r>
-              <w:rPr>
-                <w:rFonts w:ascii="Times New Roman" w:hAnsi="Times New Roman" w:cs="Times New Roman"/>
-                <w:lang w:val="en-US"/>
-              </w:rPr>
-              <w:t>,</w:t>
-            </w:r>
-            <w:r>
-              <w:rPr>
-                <w:rFonts w:ascii="Times New Roman" w:hAnsi="Times New Roman" w:cs="Times New Roman"/>
-                <w:lang w:val="en-US"/>
-              </w:rPr>
-              <w:t xml:space="preserve"> TP</w:t>
-            </w:r>
-            <w:r>
-              <w:rPr>
-                <w:rFonts w:ascii="Times New Roman" w:hAnsi="Times New Roman" w:cs="Times New Roman"/>
-                <w:lang w:val="en-US"/>
-              </w:rPr>
-              <w:t>:</w:t>
-            </w:r>
-            <w:r>
-              <w:rPr>
-                <w:rFonts w:ascii="Times New Roman" w:hAnsi="Times New Roman" w:cs="Times New Roman"/>
-                <w:lang w:val="en-US"/>
-              </w:rPr>
-              <w:t xml:space="preserve"> 26</w:t>
+              <w:t>61 test cases, TN: 28, FP: 5, FN: 2, TP: 26</w:t>
             </w:r>
           </w:p>
         </w:tc>
@@ -868,28 +623,7 @@
                 <w:rFonts w:ascii="Times New Roman" w:hAnsi="Times New Roman" w:cs="Times New Roman"/>
                 <w:lang w:val="en-US"/>
               </w:rPr>
-              <w:t xml:space="preserve">200 sequential </w:t>
-            </w:r>
-            <w:r>
-              <w:rPr>
-                <w:rFonts w:ascii="Times New Roman" w:hAnsi="Times New Roman" w:cs="Times New Roman"/>
-                <w:lang w:val="en-US"/>
-              </w:rPr>
-              <w:t>requests</w:t>
-            </w:r>
-            <w:r>
-              <w:rPr>
-                <w:rFonts w:ascii="Times New Roman" w:hAnsi="Times New Roman" w:cs="Times New Roman"/>
-                <w:lang w:val="en-US"/>
-              </w:rPr>
-              <w:t>,</w:t>
-            </w:r>
-            <w:r>
-              <w:rPr>
-                <w:rFonts w:ascii="Times New Roman" w:hAnsi="Times New Roman" w:cs="Times New Roman"/>
-                <w:lang w:val="en-US"/>
-              </w:rPr>
-              <w:t xml:space="preserve"> p95 latency 51.32ms</w:t>
+              <w:t>200 sequential requests, p95 latency 51.32ms</w:t>
             </w:r>
           </w:p>
         </w:tc>
@@ -1446,12 +1180,6 @@
         <w:gridCol w:w="4626"/>
       </w:tblGrid>
       <w:tr>
-        <w:tblPrEx>
-          <w:tblCellMar>
-            <w:top w:w="0" w:type="dxa"/>
-            <w:bottom w:w="0" w:type="dxa"/>
-          </w:tblCellMar>
-        </w:tblPrEx>
         <w:trPr>
           <w:trHeight w:val="414"/>
         </w:trPr>
@@ -1531,12 +1259,6 @@
         </w:tc>
       </w:tr>
       <w:tr>
-        <w:tblPrEx>
-          <w:tblCellMar>
-            <w:top w:w="0" w:type="dxa"/>
-            <w:bottom w:w="0" w:type="dxa"/>
-          </w:tblCellMar>
-        </w:tblPrEx>
         <w:trPr>
           <w:trHeight w:val="422"/>
         </w:trPr>
@@ -1556,21 +1278,7 @@
                 <w:rFonts w:ascii="Times New Roman" w:hAnsi="Times New Roman" w:cs="Times New Roman"/>
                 <w:lang w:val="en-US"/>
               </w:rPr>
-              <w:t xml:space="preserve">Raw / </w:t>
-            </w:r>
-            <w:r>
-              <w:rPr>
-                <w:rFonts w:ascii="Times New Roman" w:hAnsi="Times New Roman" w:cs="Times New Roman"/>
-                <w:lang w:val="en-US"/>
-              </w:rPr>
-              <w:t>prepared dat</w:t>
-            </w:r>
-            <w:r>
-              <w:rPr>
-                <w:rFonts w:ascii="Times New Roman" w:hAnsi="Times New Roman" w:cs="Times New Roman"/>
-                <w:lang w:val="en-US"/>
-              </w:rPr>
-              <w:t>a</w:t>
+              <w:t>Raw / prepared data</w:t>
             </w:r>
           </w:p>
         </w:tc>
@@ -1617,12 +1325,6 @@
         </w:tc>
       </w:tr>
       <w:tr>
-        <w:tblPrEx>
-          <w:tblCellMar>
-            <w:top w:w="0" w:type="dxa"/>
-            <w:bottom w:w="0" w:type="dxa"/>
-          </w:tblCellMar>
-        </w:tblPrEx>
         <w:trPr>
           <w:trHeight w:val="590"/>
         </w:trPr>
@@ -1696,12 +1398,6 @@
         </w:tc>
       </w:tr>
       <w:tr>
-        <w:tblPrEx>
-          <w:tblCellMar>
-            <w:top w:w="0" w:type="dxa"/>
-            <w:bottom w:w="0" w:type="dxa"/>
-          </w:tblCellMar>
-        </w:tblPrEx>
         <w:trPr>
           <w:trHeight w:val="380"/>
         </w:trPr>
@@ -2738,25 +2434,7 @@
                 <w:szCs w:val="20"/>
                 <w:lang w:val="en-US"/>
               </w:rPr>
-              <w:t>Random</w:t>
-            </w:r>
-            <w:r>
-              <w:rPr>
-                <w:rFonts w:ascii="Times New Roman" w:hAnsi="Times New Roman" w:cs="Times New Roman"/>
-                <w:sz w:val="20"/>
-                <w:szCs w:val="20"/>
-                <w:lang w:val="en-US"/>
-              </w:rPr>
-              <w:t xml:space="preserve"> </w:t>
-            </w:r>
-            <w:r>
-              <w:rPr>
-                <w:rFonts w:ascii="Times New Roman" w:hAnsi="Times New Roman" w:cs="Times New Roman"/>
-                <w:sz w:val="20"/>
-                <w:szCs w:val="20"/>
-                <w:lang w:val="en-US"/>
-              </w:rPr>
-              <w:t>Forest</w:t>
+              <w:t>Random Forest</w:t>
             </w:r>
           </w:p>
         </w:tc>
@@ -3885,15 +3563,7 @@
                 <w:sz w:val="20"/>
                 <w:szCs w:val="20"/>
               </w:rPr>
-              <w:t>8</w:t>
-            </w:r>
-            <w:r>
-              <w:rPr>
-                <w:rFonts w:ascii="Times New Roman" w:hAnsi="Times New Roman" w:cs="Times New Roman"/>
-                <w:sz w:val="20"/>
-                <w:szCs w:val="20"/>
-              </w:rPr>
-              <w:t>469</w:t>
+              <w:t>8469</w:t>
             </w:r>
           </w:p>
         </w:tc>
@@ -4275,56 +3945,7 @@
           <w:rFonts w:ascii="Times New Roman" w:hAnsi="Times New Roman" w:cs="Times New Roman"/>
           <w:lang w:val="en-US"/>
         </w:rPr>
-        <w:t xml:space="preserve"> </w:t>
-      </w:r>
-      <w:r>
-        <w:rPr>
-          <w:rFonts w:ascii="Times New Roman" w:hAnsi="Times New Roman" w:cs="Times New Roman"/>
-          <w:lang w:val="en-US"/>
-        </w:rPr>
-        <w:t>200 trees</w:t>
-      </w:r>
-      <w:r>
-        <w:rPr>
-          <w:rFonts w:ascii="Times New Roman" w:hAnsi="Times New Roman" w:cs="Times New Roman"/>
-          <w:lang w:val="en-US"/>
-        </w:rPr>
-        <w:t xml:space="preserve">, </w:t>
-      </w:r>
-      <w:r>
-        <w:rPr>
-          <w:rFonts w:ascii="Times New Roman" w:hAnsi="Times New Roman" w:cs="Times New Roman"/>
-          <w:lang w:val="en-US"/>
-        </w:rPr>
-        <w:t>max_depth = 5</w:t>
-      </w:r>
-      <w:r>
-        <w:rPr>
-          <w:rFonts w:ascii="Times New Roman" w:hAnsi="Times New Roman" w:cs="Times New Roman"/>
-          <w:lang w:val="en-US"/>
-        </w:rPr>
-        <w:t xml:space="preserve">, </w:t>
-      </w:r>
-      <w:r>
-        <w:rPr>
-          <w:rFonts w:ascii="Times New Roman" w:hAnsi="Times New Roman" w:cs="Times New Roman"/>
-          <w:lang w:val="en-US"/>
-        </w:rPr>
-        <w:t>min_samples_leaf = 3</w:t>
-      </w:r>
-      <w:r>
-        <w:rPr>
-          <w:rFonts w:ascii="Times New Roman" w:hAnsi="Times New Roman" w:cs="Times New Roman"/>
-          <w:lang w:val="en-US"/>
-        </w:rPr>
-        <w:t xml:space="preserve">, </w:t>
-      </w:r>
-      <w:r>
-        <w:rPr>
-          <w:rFonts w:ascii="Times New Roman" w:hAnsi="Times New Roman" w:cs="Times New Roman"/>
-          <w:lang w:val="en-US"/>
-        </w:rPr>
-        <w:t>class_weight = balanced</w:t>
+        <w:t xml:space="preserve"> 200 trees, max_depth = 5, min_samples_leaf = 3, class_weight = balanced</w:t>
       </w:r>
     </w:p>
     <w:p>
@@ -4916,25 +4537,7 @@
           <w:bCs/>
           <w:lang w:val="en-US"/>
         </w:rPr>
-        <w:t xml:space="preserve"> </w:t>
-      </w:r>
-      <w:r>
-        <w:rPr>
-          <w:rFonts w:ascii="Times New Roman" w:hAnsi="Times New Roman" w:cs="Times New Roman"/>
-          <w:b/>
-          <w:bCs/>
-          <w:lang w:val="en-US"/>
-        </w:rPr>
-        <w:t>Interpretation</w:t>
-      </w:r>
-      <w:r>
-        <w:rPr>
-          <w:rFonts w:ascii="Times New Roman" w:hAnsi="Times New Roman" w:cs="Times New Roman"/>
-          <w:b/>
-          <w:bCs/>
-          <w:lang w:val="en-US"/>
-        </w:rPr>
-        <w:t>:</w:t>
+        <w:t xml:space="preserve"> Interpretation:</w:t>
       </w:r>
     </w:p>
     <w:p>
@@ -5227,25 +4830,7 @@
           <w:bCs/>
           <w:lang w:val="en-US"/>
         </w:rPr>
-        <w:t xml:space="preserve"> </w:t>
-      </w:r>
-      <w:r>
-        <w:rPr>
-          <w:rFonts w:ascii="Times New Roman" w:hAnsi="Times New Roman" w:cs="Times New Roman"/>
-          <w:b/>
-          <w:bCs/>
-          <w:lang w:val="en-US"/>
-        </w:rPr>
-        <w:t>Integrity</w:t>
-      </w:r>
-      <w:r>
-        <w:rPr>
-          <w:rFonts w:ascii="Times New Roman" w:hAnsi="Times New Roman" w:cs="Times New Roman"/>
-          <w:b/>
-          <w:bCs/>
-          <w:lang w:val="en-US"/>
-        </w:rPr>
-        <w:t>:</w:t>
+        <w:t xml:space="preserve"> Integrity:</w:t>
       </w:r>
     </w:p>
     <w:p>
@@ -8090,14 +7675,7 @@
                 <w:rFonts w:ascii="Times New Roman" w:hAnsi="Times New Roman" w:cs="Times New Roman"/>
                 <w:lang w:val="en-US"/>
               </w:rPr>
-              <w:t xml:space="preserve"> 10 </w:t>
-            </w:r>
-            <w:r>
-              <w:rPr>
-                <w:rFonts w:ascii="Times New Roman" w:hAnsi="Times New Roman" w:cs="Times New Roman"/>
-                <w:lang w:val="en-US"/>
-              </w:rPr>
-              <w:t>invalids</w:t>
+              <w:t xml:space="preserve"> 10 invalids</w:t>
             </w:r>
             <w:r>
               <w:rPr>
@@ -9264,7 +8842,7 @@
           <w:szCs w:val="20"/>
           <w:lang w:val="en-US"/>
         </w:rPr>
-        <w:t>reports/model_selection.md</w:t>
+        <w:t>reports/model_selection.md,</w:t>
       </w:r>
       <w:r>
         <w:rPr>
@@ -9273,7 +8851,7 @@
           <w:szCs w:val="20"/>
           <w:lang w:val="en-US"/>
         </w:rPr>
-        <w:t>,</w:t>
+        <w:t xml:space="preserve"> </w:t>
       </w:r>
       <w:r>
         <w:rPr>
@@ -9282,7 +8860,7 @@
           <w:szCs w:val="20"/>
           <w:lang w:val="en-US"/>
         </w:rPr>
-        <w:t xml:space="preserve"> </w:t>
+        <w:t>reports/test_metrics.json, reports/mlflow_experiment_summary.md,</w:t>
       </w:r>
       <w:r>
         <w:rPr>
@@ -9291,7 +8869,7 @@
           <w:szCs w:val="20"/>
           <w:lang w:val="en-US"/>
         </w:rPr>
-        <w:t>reports/test_metrics.json</w:t>
+        <w:t xml:space="preserve"> </w:t>
       </w:r>
       <w:r>
         <w:rPr>
@@ -9300,7 +8878,7 @@
           <w:szCs w:val="20"/>
           <w:lang w:val="en-US"/>
         </w:rPr>
-        <w:t xml:space="preserve">, </w:t>
+        <w:t>docs/monitoring_baseline.md, docs/screenshots/, .github/workflows/ci.yml,</w:t>
       </w:r>
       <w:r>
         <w:rPr>
@@ -9309,7 +8887,7 @@
           <w:szCs w:val="20"/>
           <w:lang w:val="en-US"/>
         </w:rPr>
-        <w:t>reports/mlflow_experiment_summary.md</w:t>
+        <w:t xml:space="preserve"> </w:t>
       </w:r>
       <w:r>
         <w:rPr>
@@ -9318,87 +8896,6 @@
           <w:szCs w:val="20"/>
           <w:lang w:val="en-US"/>
         </w:rPr>
-        <w:t>,</w:t>
-      </w:r>
-      <w:r>
-        <w:rPr>
-          <w:rFonts w:ascii="Times New Roman" w:hAnsi="Times New Roman" w:cs="Times New Roman"/>
-          <w:sz w:val="20"/>
-          <w:szCs w:val="20"/>
-          <w:lang w:val="en-US"/>
-        </w:rPr>
-        <w:t xml:space="preserve"> </w:t>
-      </w:r>
-      <w:r>
-        <w:rPr>
-          <w:rFonts w:ascii="Times New Roman" w:hAnsi="Times New Roman" w:cs="Times New Roman"/>
-          <w:sz w:val="20"/>
-          <w:szCs w:val="20"/>
-          <w:lang w:val="en-US"/>
-        </w:rPr>
-        <w:t>docs/monitoring_baseline.md</w:t>
-      </w:r>
-      <w:r>
-        <w:rPr>
-          <w:rFonts w:ascii="Times New Roman" w:hAnsi="Times New Roman" w:cs="Times New Roman"/>
-          <w:sz w:val="20"/>
-          <w:szCs w:val="20"/>
-          <w:lang w:val="en-US"/>
-        </w:rPr>
-        <w:t xml:space="preserve">, </w:t>
-      </w:r>
-      <w:r>
-        <w:rPr>
-          <w:rFonts w:ascii="Times New Roman" w:hAnsi="Times New Roman" w:cs="Times New Roman"/>
-          <w:sz w:val="20"/>
-          <w:szCs w:val="20"/>
-          <w:lang w:val="en-US"/>
-        </w:rPr>
-        <w:t>docs/screenshots/</w:t>
-      </w:r>
-      <w:r>
-        <w:rPr>
-          <w:rFonts w:ascii="Times New Roman" w:hAnsi="Times New Roman" w:cs="Times New Roman"/>
-          <w:sz w:val="20"/>
-          <w:szCs w:val="20"/>
-          <w:lang w:val="en-US"/>
-        </w:rPr>
-        <w:t xml:space="preserve">, </w:t>
-      </w:r>
-      <w:r>
-        <w:rPr>
-          <w:rFonts w:ascii="Times New Roman" w:hAnsi="Times New Roman" w:cs="Times New Roman"/>
-          <w:sz w:val="20"/>
-          <w:szCs w:val="20"/>
-          <w:lang w:val="en-US"/>
-        </w:rPr>
-        <w:t>.github/workflows/ci.yml</w:t>
-      </w:r>
-      <w:r>
-        <w:rPr>
-          <w:rFonts w:ascii="Times New Roman" w:hAnsi="Times New Roman" w:cs="Times New Roman"/>
-          <w:sz w:val="20"/>
-          <w:szCs w:val="20"/>
-          <w:lang w:val="en-US"/>
-        </w:rPr>
-        <w:t>,</w:t>
-      </w:r>
-      <w:r>
-        <w:rPr>
-          <w:rFonts w:ascii="Times New Roman" w:hAnsi="Times New Roman" w:cs="Times New Roman"/>
-          <w:sz w:val="20"/>
-          <w:szCs w:val="20"/>
-          <w:lang w:val="en-US"/>
-        </w:rPr>
-        <w:t xml:space="preserve"> </w:t>
-      </w:r>
-      <w:r>
-        <w:rPr>
-          <w:rFonts w:ascii="Times New Roman" w:hAnsi="Times New Roman" w:cs="Times New Roman"/>
-          <w:sz w:val="20"/>
-          <w:szCs w:val="20"/>
-          <w:lang w:val="en-US"/>
-        </w:rPr>
         <w:t>docs/architecture.md</w:t>
       </w:r>
     </w:p>
@@ -9419,20 +8916,55 @@
         <w:rPr>
           <w:rFonts w:ascii="Times New Roman" w:hAnsi="Times New Roman" w:cs="Times New Roman"/>
         </w:rPr>
-        <w:t xml:space="preserve"> A short demonstration video is included in the repository's </w:t>
-      </w:r>
-      <w:r>
-        <w:rPr>
-          <w:rStyle w:val="HTMLCode"/>
-          <w:rFonts w:ascii="Times New Roman" w:eastAsiaTheme="minorHAnsi" w:hAnsi="Times New Roman" w:cs="Times New Roman"/>
-        </w:rPr>
-        <w:t>submission/</w:t>
-      </w:r>
-      <w:r>
-        <w:rPr>
-          <w:rFonts w:ascii="Times New Roman" w:hAnsi="Times New Roman" w:cs="Times New Roman"/>
-        </w:rPr>
-        <w:t xml:space="preserve"> directory.</w:t>
+        <w:t xml:space="preserve"> A short demonstration video</w:t>
+      </w:r>
+      <w:r>
+        <w:rPr>
+          <w:rFonts w:ascii="Times New Roman" w:hAnsi="Times New Roman" w:cs="Times New Roman"/>
+        </w:rPr>
+        <w:t xml:space="preserve"> link</w:t>
+      </w:r>
+      <w:r>
+        <w:rPr>
+          <w:rFonts w:ascii="Times New Roman" w:hAnsi="Times New Roman" w:cs="Times New Roman"/>
+        </w:rPr>
+        <w:t xml:space="preserve"> can be accessed from drive </w:t>
+      </w:r>
+      <w:hyperlink r:id="rId17" w:history="1">
+        <w:r>
+          <w:rPr>
+            <w:rStyle w:val="Hyperlink"/>
+            <w:rFonts w:ascii="Times New Roman" w:hAnsi="Times New Roman" w:cs="Times New Roman"/>
+          </w:rPr>
+          <w:t>Video_Demonstration_</w:t>
+        </w:r>
+        <w:r>
+          <w:rPr>
+            <w:rStyle w:val="Hyperlink"/>
+            <w:rFonts w:ascii="Times New Roman" w:hAnsi="Times New Roman" w:cs="Times New Roman"/>
+          </w:rPr>
+          <w:t>D</w:t>
+        </w:r>
+        <w:r>
+          <w:rPr>
+            <w:rStyle w:val="Hyperlink"/>
+            <w:rFonts w:ascii="Times New Roman" w:hAnsi="Times New Roman" w:cs="Times New Roman"/>
+          </w:rPr>
+          <w:t>r</w:t>
+        </w:r>
+        <w:r>
+          <w:rPr>
+            <w:rStyle w:val="Hyperlink"/>
+            <w:rFonts w:ascii="Times New Roman" w:hAnsi="Times New Roman" w:cs="Times New Roman"/>
+          </w:rPr>
+          <w:t>ive_Link</w:t>
+        </w:r>
+      </w:hyperlink>
+      <w:r>
+        <w:rPr>
+          <w:rFonts w:ascii="Times New Roman" w:hAnsi="Times New Roman" w:cs="Times New Roman"/>
+        </w:rPr>
+        <w:t>.</w:t>
       </w:r>
     </w:p>
     <w:p>
@@ -11512,6 +11044,41 @@
       <w:szCs w:val="20"/>
     </w:rPr>
   </w:style>
+  <w:style w:type="character" w:styleId="Hyperlink">
+    <w:name w:val="Hyperlink"/>
+    <w:basedOn w:val="DefaultParagraphFont"/>
+    <w:uiPriority w:val="99"/>
+    <w:unhideWhenUsed/>
+    <w:rsid w:val="0009546C"/>
+    <w:rPr>
+      <w:color w:val="467886" w:themeColor="hyperlink"/>
+      <w:u w:val="single"/>
+    </w:rPr>
+  </w:style>
+  <w:style w:type="character" w:styleId="UnresolvedMention">
+    <w:name w:val="Unresolved Mention"/>
+    <w:basedOn w:val="DefaultParagraphFont"/>
+    <w:uiPriority w:val="99"/>
+    <w:semiHidden/>
+    <w:unhideWhenUsed/>
+    <w:rsid w:val="0009546C"/>
+    <w:rPr>
+      <w:color w:val="605E5C"/>
+      <w:shd w:val="clear" w:color="auto" w:fill="E1DFDD"/>
+    </w:rPr>
+  </w:style>
+  <w:style w:type="character" w:styleId="FollowedHyperlink">
+    <w:name w:val="FollowedHyperlink"/>
+    <w:basedOn w:val="DefaultParagraphFont"/>
+    <w:uiPriority w:val="99"/>
+    <w:semiHidden/>
+    <w:unhideWhenUsed/>
+    <w:rsid w:val="0009546C"/>
+    <w:rPr>
+      <w:color w:val="96607D" w:themeColor="followedHyperlink"/>
+      <w:u w:val="single"/>
+    </w:rPr>
+  </w:style>
 </w:styles>
 </file>
 

</xml_diff>

<commit_message>
docs: add final heart disease prediction report PDF and update Word document
</commit_message>
<xml_diff>
--- a/submission/Heart Disease Prediction Final Report.docx
+++ b/submission/Heart Disease Prediction Final Report.docx
@@ -8936,30 +8936,42 @@
             <w:rStyle w:val="Hyperlink"/>
             <w:rFonts w:ascii="Times New Roman" w:hAnsi="Times New Roman" w:cs="Times New Roman"/>
           </w:rPr>
-          <w:t>Video_Demonstration_</w:t>
+          <w:t>Video_Demonstration_Drive_Link</w:t>
         </w:r>
+      </w:hyperlink>
+      <w:r>
+        <w:rPr>
+          <w:rFonts w:ascii="Times New Roman" w:hAnsi="Times New Roman" w:cs="Times New Roman"/>
+        </w:rPr>
+        <w:t xml:space="preserve"> </w:t>
+      </w:r>
+      <w:r>
+        <w:rPr>
+          <w:rFonts w:ascii="Times New Roman" w:hAnsi="Times New Roman" w:cs="Times New Roman"/>
+          <w:sz w:val="16"/>
+          <w:szCs w:val="16"/>
+        </w:rPr>
+        <w:t>(</w:t>
+      </w:r>
+      <w:hyperlink r:id="rId18" w:history="1">
         <w:r>
           <w:rPr>
             <w:rStyle w:val="Hyperlink"/>
             <w:rFonts w:ascii="Times New Roman" w:hAnsi="Times New Roman" w:cs="Times New Roman"/>
+            <w:sz w:val="16"/>
+            <w:szCs w:val="16"/>
           </w:rPr>
-          <w:t>D</w:t>
-        </w:r>
-        <w:r>
-          <w:rPr>
-            <w:rStyle w:val="Hyperlink"/>
-            <w:rFonts w:ascii="Times New Roman" w:hAnsi="Times New Roman" w:cs="Times New Roman"/>
-          </w:rPr>
-          <w:t>r</w:t>
-        </w:r>
-        <w:r>
-          <w:rPr>
-            <w:rStyle w:val="Hyperlink"/>
-            <w:rFonts w:ascii="Times New Roman" w:hAnsi="Times New Roman" w:cs="Times New Roman"/>
-          </w:rPr>
-          <w:t>ive_Link</w:t>
+          <w:t>https://drive.google.com/file/d/1aTfFwcSTxKQ8tIBuP9croGbyMqDBxm7u/view?usp=sharing</w:t>
         </w:r>
       </w:hyperlink>
+      <w:r>
+        <w:rPr>
+          <w:rFonts w:ascii="Times New Roman" w:hAnsi="Times New Roman" w:cs="Times New Roman"/>
+          <w:sz w:val="16"/>
+          <w:szCs w:val="16"/>
+        </w:rPr>
+        <w:t>)</w:t>
+      </w:r>
       <w:r>
         <w:rPr>
           <w:rFonts w:ascii="Times New Roman" w:hAnsi="Times New Roman" w:cs="Times New Roman"/>
@@ -9000,7 +9012,19 @@
         <w:rPr>
           <w:rFonts w:ascii="Times New Roman" w:hAnsi="Times New Roman" w:cs="Times New Roman"/>
         </w:rPr>
-        <w:t xml:space="preserve">) format under </w:t>
+        <w:t>)</w:t>
+      </w:r>
+      <w:r>
+        <w:rPr>
+          <w:rFonts w:ascii="Times New Roman" w:hAnsi="Times New Roman" w:cs="Times New Roman"/>
+        </w:rPr>
+        <w:t xml:space="preserve"> and PDF</w:t>
+      </w:r>
+      <w:r>
+        <w:rPr>
+          <w:rFonts w:ascii="Times New Roman" w:hAnsi="Times New Roman" w:cs="Times New Roman"/>
+        </w:rPr>
+        <w:t xml:space="preserve"> format under </w:t>
       </w:r>
       <w:r>
         <w:rPr>

</xml_diff>